<commit_message>
feat: redesign as magazine portfolio experience
</commit_message>
<xml_diff>
--- a/docs/个人博客使用与维护说明.docx
+++ b/docs/个人博客使用与维护说明.docx
@@ -12,11 +12,7 @@
     </w:p>
     <w:p>
       <w:r>
-        <w:rPr>
-          <w:color w:val="087F72"/>
-          <w:sz w:val="26"/>
-        </w:rPr>
-        <w:t>Astro + React + Three.js 博客与作品集</w:t>
+        <w:t>Astro + Canvas 2D 杂志式个人网站</w:t>
       </w:r>
     </w:p>
     <w:p>
@@ -103,7 +99,7 @@
           </w:tcPr>
           <w:p>
             <w:r>
-              <w:t>26 个页面构建成功</w:t>
+              <w:t>32 个页面构建成功</w:t>
             </w:r>
           </w:p>
         </w:tc>
@@ -125,7 +121,7 @@
           </w:tcPr>
           <w:p>
             <w:r>
-              <w:t>6 个文章与项目详情页，689 个词</w:t>
+              <w:t>9 个文章与项目详情页，689 个词</w:t>
             </w:r>
           </w:p>
         </w:tc>
@@ -169,7 +165,7 @@
           </w:tcPr>
           <w:p>
             <w:r>
-              <w:t>性能 93 / 无障碍 100 / 最佳实践 100 / SEO 100</w:t>
+              <w:t>性能 99 / 无障碍 100 / 最佳实践 100 / SEO 100</w:t>
             </w:r>
           </w:p>
         </w:tc>
@@ -191,7 +187,7 @@
           </w:tcPr>
           <w:p>
             <w:r>
-              <w:t>性能 100 / 无障碍 100 / 最佳实践 100 / SEO 100</w:t>
+              <w:t>数据页 Lighthouse 100 / 100 / 100 / 100</w:t>
             </w:r>
           </w:p>
         </w:tc>
@@ -215,7 +211,7 @@
         <w:pStyle w:val="ListBullet"/>
       </w:pPr>
       <w:r>
-        <w:t>首页：粒子几何体 3D 主视觉、精选文章、精选项目和经历时间线。</w:t>
+        <w:t>首页：杂志式封面、轻量粒子动画、精选项目经历、作品与数据预览。</w:t>
       </w:r>
     </w:p>
     <w:p>
@@ -223,7 +219,7 @@
         <w:pStyle w:val="ListBullet"/>
       </w:pPr>
       <w:r>
-        <w:t>博客：文章列表、分类、标签、归档、文章目录、阅读进度和相关阅读。</w:t>
+        <w:t>个人介绍：个人定位、关注方向、创作原则和当前状态。</w:t>
       </w:r>
     </w:p>
     <w:p>
@@ -231,7 +227,7 @@
         <w:pStyle w:val="ListBullet"/>
       </w:pPr>
       <w:r>
-        <w:t>项目：项目列表与详情，支持技术栈、年份、职责、访问链接和代码链接。</w:t>
+        <w:t>项目经历：按时间线整理实践阶段、职责、行动和成果。</w:t>
       </w:r>
     </w:p>
     <w:p>
@@ -239,7 +235,7 @@
         <w:pStyle w:val="ListBullet"/>
       </w:pPr>
       <w:r>
-        <w:t>关于：个人介绍、能力方向和近况，可集中替换为真实资料。</w:t>
+        <w:t>作品展示：项目卡片、技术栈、项目详情和结果说明。</w:t>
       </w:r>
     </w:p>
     <w:p>
@@ -247,7 +243,7 @@
         <w:pStyle w:val="ListBullet"/>
       </w:pPr>
       <w:r>
-        <w:t>搜索：Pagefind 在构建时生成静态索引，无需服务器或数据库。</w:t>
+        <w:t>数据图表：项目推进趋势、能力分布、时间分配和行动结论。</w:t>
       </w:r>
     </w:p>
     <w:p>
@@ -255,7 +251,7 @@
         <w:pStyle w:val="ListBullet"/>
       </w:pPr>
       <w:r>
-        <w:t>主题：暗色优先，可切换浅色主题；支持减少动画与无 WebGL 降级。</w:t>
+        <w:t>辅助页面：搜索、RSS、Sitemap 和 404 继续保留。</w:t>
       </w:r>
     </w:p>
     <w:p>
@@ -263,7 +259,7 @@
         <w:pStyle w:val="ListBullet"/>
       </w:pPr>
       <w:r>
-        <w:t>SEO：RSS、站点地图、Canonical、Open Graph 和结构化数据。</w:t>
+        <w:t>性能优化：移除 React 和 Three.js，改用 Canvas 2D 与 CSS transform，避免滚动布局跳动。</w:t>
       </w:r>
     </w:p>
     <w:p>
@@ -339,7 +335,7 @@
         <w:br/>
         <w:t>├─ src\assets\covers       文章和项目封面</w:t>
         <w:br/>
-        <w:t>├─ src\components          页面组件与 3D 组件</w:t>
+        <w:t>├─ src\components          页面组件与 Canvas 动画</w:t>
         <w:br/>
         <w:t>├─ src\pages               网站路由</w:t>
         <w:br/>

</xml_diff>